<commit_message>
New domain: www.resdish.com, support@resdish.com
Receipts, the sign-up email, default support and no-reply addresses, the settings example, the sales deck, the
partnership proposal and the go-live checklist use resdish.com instead of bite-wise.org. Guide updated.

Co-Authored-By: Claude Opus 5.5 <noreply@anthropic.com>
Claude-Session: https://claude.ai/code/session_01TTXERQ5iqw3mLUpLGAhJam
</commit_message>
<xml_diff>
--- a/docs/business/ResDish-Restaurant-Partnership-Proposal.docx
+++ b/docs/business/ResDish-Restaurant-Partnership-Proposal.docx
@@ -224,7 +224,7 @@
                 <w:rFonts w:ascii="Arial" w:cs="Arial" w:eastAsia="Arial" w:hAnsi="Arial"/>
                 <w:color w:val="1E293B"/>
               </w:rPr>
-              <w:t xml:space="preserve">ResDish Partnerships Team · support@bite-wise.org</w:t>
+              <w:t xml:space="preserve">ResDish Partnerships Team · support@resdish.com</w:t>
             </w:r>
           </w:p>
         </w:tc>
@@ -3676,7 +3676,7 @@
         <w:rPr>
           <w:rFonts w:ascii="Arial" w:cs="Arial" w:eastAsia="Arial" w:hAnsi="Arial"/>
         </w:rPr>
-        <w:t xml:space="preserve">at bite-wise.org with your restaurant details, and accept the Restaurant Partner Agreement electronically.</w:t>
+        <w:t xml:space="preserve">at resdish.com with your restaurant details, and accept the Restaurant Partner Agreement electronically.</w:t>
       </w:r>
     </w:p>
     <w:p>
@@ -4261,7 +4261,7 @@
         <w:rPr>
           <w:rFonts w:ascii="Arial" w:cs="Arial" w:eastAsia="Arial" w:hAnsi="Arial"/>
         </w:rPr>
-        <w:t xml:space="preserve">at bite-wise.org → "I'm a restaurant". It takes about five minutes.</w:t>
+        <w:t xml:space="preserve">at resdish.com → "I'm a restaurant". It takes about five minutes.</w:t>
       </w:r>
     </w:p>
     <w:p>
@@ -4309,7 +4309,7 @@
         <w:rPr>
           <w:rFonts w:ascii="Arial" w:cs="Arial" w:eastAsia="Arial" w:hAnsi="Arial"/>
         </w:rPr>
-        <w:t xml:space="preserve">Email support@bite-wise.org.</w:t>
+        <w:t xml:space="preserve">Email support@resdish.com.</w:t>
       </w:r>
     </w:p>
     <w:p>
@@ -4809,7 +4809,7 @@
         <w:sz w:val="16"/>
         <w:szCs w:val="16"/>
       </w:rPr>
-      <w:t xml:space="preserve">ResDish · Eat well, waste less · support@bite-wise.org</w:t>
+      <w:t xml:space="preserve">ResDish · Eat well, waste less · support@resdish.com</w:t>
     </w:r>
     <w:r>
       <w:rPr>

</xml_diff>